<commit_message>
Preserve line breaks when hyperlinking multi-line text
</commit_message>
<xml_diff>
--- a/src/test/resources/word-filler/full-suite.docx
+++ b/src/test/resources/word-filler/full-suite.docx
@@ -46,6 +46,11 @@
     <w:p>
       <w:r>
         <w:t>No placeholders here.</w:t>
+      </w:r>
+    </w:p>
+    <w:p>
+      <w:r>
+        <w:t>{$model.signature}</w:t>
       </w:r>
     </w:p>
     <w:tbl>

</xml_diff>